<commit_message>
Especificaciones: CAR Varones con metrado 23-10 y laminas DPLV; lloraderos con cuadro de materiales del desagregado
Co-Authored-By: Claude Opus 5.5 <noreply@anthropic.com>
Claude-Session: https://claude.ai/code/session_0142t8T16igb3VKxUPwnQPq6
</commit_message>
<xml_diff>
--- a/entregables_varones/ESPECIFICACIONES_TECNICAS_DRENAJE_PLUVIAL_CAR_VARONES.docx
+++ b/entregables_varones/ESPECIFICACIONES_TECNICAS_DRENAJE_PLUVIAL_CAR_VARONES.docx
@@ -109,7 +109,7 @@
           <w:sz w:val="22"/>
           <w:szCs w:val="22"/>
         </w:rPr>
-        <w:t xml:space="preserve">CREACIÓN DEL SERVICIO DE PROTECCIÓN INTEGRAL A NIÑAS, NIÑOS Y ADOLESCENTES SIN CUIDADOS PARENTALES O EN RIESGO DE PERDERLOS EN CENTRO DE ACOGIDA RESIDENCIAL - VARONES DISTRITO DE MORALES DE LA PROVINCIA DE SAN MARTÍN DEL DEPARTAMENTO DE SAN MARTÍN, con CUI N.° 2705619</w:t>
+        <w:t xml:space="preserve">CREACIÓN DEL SERVICIO DE PROTECCIÓN INTEGRAL A NIÑAS, NIÑOS Y ADOLESCENTES SIN CUIDADOS PARENTALES O EN RIESGO DE PERDERLOS EN CENTRO DE ACOGIDA RESIDENCIAL - VARONES DISTRITO DE MORALES DE LA PROVINCIA DE SAN MARTÍN DEL DEPARTAMENTO DE SAN MARTÍN</w:t>
       </w:r>
     </w:p>
     <w:p>
@@ -234,7 +234,7 @@
           <w:sz w:val="20"/>
           <w:szCs w:val="20"/>
         </w:rPr>
-        <w:t xml:space="preserve">Las presentes especificaciones técnicas definen la calidad de los materiales, los procedimientos de ejecución, los controles, la seguridad, la unidad de medida, el método de medición y la forma de pago de cada partida de la especialidad de drenaje pluvial del proyecto CREACIÓN DEL SERVICIO DE PROTECCIÓN INTEGRAL A NIÑAS, NIÑOS Y ADOLESCENTES SIN CUIDADOS PARENTALES O EN RIESGO DE PERDERLOS EN CENTRO DE ACOGIDA RESIDENCIAL - VARONES DISTRITO DE MORALES DE LA PROVINCIA DE SAN MARTÍN DEL DEPARTAMENTO DE SAN MARTÍN, con CUI N.° 2705619, con CUI N.° 2705619.</w:t>
+        <w:t xml:space="preserve">Las presentes especificaciones técnicas definen la calidad de los materiales, los procedimientos de ejecución, los controles, la seguridad, la unidad de medida, el método de medición y la forma de pago de cada partida de la especialidad de drenaje pluvial del proyecto CREACIÓN DEL SERVICIO DE PROTECCIÓN INTEGRAL A NIÑAS, NIÑOS Y ADOLESCENTES SIN CUIDADOS PARENTALES O EN RIESGO DE PERDERLOS EN CENTRO DE ACOGIDA RESIDENCIAL - VARONES DISTRITO DE MORALES DE LA PROVINCIA DE SAN MARTÍN DEL DEPARTAMENTO DE SAN MARTÍN, con CUI N.° 2705619.</w:t>
       </w:r>
     </w:p>
     <w:p>
@@ -8029,7 +8029,7 @@
           <w:sz w:val="20"/>
           <w:szCs w:val="20"/>
         </w:rPr>
-        <w:t xml:space="preserve">Según la lámina DJ-03: cada módulo de 1.00 m (0.997 m fabricado, 3 mm de holgura entre módulos) tiene 2 ángulos L 1" x 1" x 3/16" con el ala horizontal apoyada en el rebaje y el ala vertical hacia la cuneta, y 39 platinas de 1" x 3/16" x 0.446 m de canto @1" entre ejes (abertura libre 0.021 m), soldadas a tope al ala vertical. El módulo mide 0.497 m de ancho y se apoya en el rebaje de 0.05 x 1" del borde interior de cada muro, a ras del borde superior de la cuneta; pesa 20.0 kg por metro.</w:t>
+        <w:t xml:space="preserve">Según la lámina DPLV-33: cada módulo de 1.00 m (0.997 m fabricado, 3 mm de holgura entre módulos) tiene 2 ángulos L 1" x 1" x 3/16" con el ala horizontal apoyada en el rebaje y el ala vertical hacia la cuneta, y 39 platinas de 1" x 3/16" x 0.446 m de canto @1" entre ejes (abertura libre 0.021 m), soldadas a tope al ala vertical. El módulo mide 0.497 m de ancho y se apoya en el rebaje de 0.05 x 1" del borde interior de cada muro, a ras del borde superior de la cuneta; pesa 20.0 kg por metro.</w:t>
       </w:r>
     </w:p>
     <w:p>
@@ -8859,7 +8859,7 @@
           <w:sz w:val="20"/>
           <w:szCs w:val="20"/>
         </w:rPr>
-        <w:t xml:space="preserve">Comprende las juntas de dilatación de 1" (0.0254 m) de las cunetas, cada 3.00 m y en los cambios de dirección, en toda la sección en U: los dos muros y la losa de fondo, de modo que cada tramo entre juntas trabaje independiente, según la EG-2013 MTC, Sección 510 (cunetas revestidas de concreto). La junta lleva plancha de tecnopor de 1" en todo el espesor y sellador asfáltico (asfalto líquido RC-250 + arena gruesa) en la cara interior, según las láminas DJ-01 y DJ-02.</w:t>
+        <w:t xml:space="preserve">Comprende las juntas de dilatación de 1" (0.0254 m) de las cunetas, cada 3.00 m y en los cambios de dirección, en toda la sección en U: los dos muros y la losa de fondo, de modo que cada tramo entre juntas trabaje independiente, según la EG-2013 MTC, Sección 510 (cunetas revestidas de concreto). La junta lleva plancha de tecnopor de 1" en todo el espesor y sellador asfáltico (asfalto líquido RC-250 + arena gruesa) en la cara interior, según las láminas DPLV-31 y DPLV-32.</w:t>
       </w:r>
     </w:p>
     <w:p>
@@ -9276,7 +9276,1197 @@
           <w:sz w:val="20"/>
           <w:szCs w:val="20"/>
         </w:rPr>
-        <w:t xml:space="preserve">Ubicación: solo en los tramos de muro de cuneta colindantes con área verde de la hoja METRADO LLORADEROS (eje, lado del muro y progresivas); los tramos junto a veredas, pisos o edificaciones no llevan lloraderos.</w:t>
+        <w:t xml:space="preserve">Ubicación: solo en los tramos de muro de cuneta colindantes con área verde de la hoja METRADO LLORADEROS (eje, lado del muro y progresivas); los tramos junto a veredas, pisos o edificaciones no llevan lloraderos. Planos: DPLV-43 (planta de ubicación), DPLV-35 (detalle del lloradero: corte, tubo perforado y desagregado) y DPLV-34 (isométrico de instalación).</w:t>
+      </w:r>
+    </w:p>
+    <w:p>
+      <w:pPr>
+        <w:spacing w:after="100" w:before="0" w:line="276"/>
+        <w:jc w:val="both"/>
+      </w:pPr>
+      <w:r>
+        <w:rPr>
+          <w:rFonts w:ascii="Arial" w:cs="Arial" w:eastAsia="Arial" w:hAnsi="Arial"/>
+          <w:sz w:val="20"/>
+          <w:szCs w:val="20"/>
+        </w:rPr>
+        <w:t xml:space="preserve">Materiales de la partida, por lloradero y en total (hoja DESAGREGADO LLORADEROS del metrado; costo en la hoja ACU LLORADEROS):</w:t>
+      </w:r>
+    </w:p>
+    <w:tbl>
+      <w:tblPr>
+        <w:tblW w:type="dxa" w:w="9071"/>
+        <w:tblBorders>
+          <w:top w:val="single" w:color="auto" w:sz="4"/>
+          <w:left w:val="single" w:color="auto" w:sz="4"/>
+          <w:bottom w:val="single" w:color="auto" w:sz="4"/>
+          <w:right w:val="single" w:color="auto" w:sz="4"/>
+          <w:insideH w:val="single" w:color="auto" w:sz="4"/>
+          <w:insideV w:val="single" w:color="auto" w:sz="4"/>
+        </w:tblBorders>
+      </w:tblPr>
+      <w:tblGrid>
+        <w:gridCol w:w="3991"/>
+        <w:gridCol w:w="726"/>
+        <w:gridCol w:w="1542"/>
+        <w:gridCol w:w="1361"/>
+        <w:gridCol w:w="1451"/>
+      </w:tblGrid>
+      <w:tr>
+        <w:trPr>
+          <w:tblHeader/>
+        </w:trPr>
+        <w:tc>
+          <w:tcPr>
+            <w:tcW w:type="dxa" w:w="3991"/>
+            <w:tcBorders>
+              <w:top w:val="single" w:color="808080" w:sz="4"/>
+              <w:left w:val="single" w:color="808080" w:sz="4"/>
+              <w:bottom w:val="single" w:color="808080" w:sz="4"/>
+              <w:right w:val="single" w:color="808080" w:sz="4"/>
+            </w:tcBorders>
+            <w:shd w:fill="D9E2F3" w:color="auto" w:val="clear"/>
+            <w:tcMar>
+              <w:top w:type="dxa" w:w="60"/>
+              <w:left w:type="dxa" w:w="90"/>
+              <w:bottom w:type="dxa" w:w="60"/>
+              <w:right w:type="dxa" w:w="90"/>
+            </w:tcMar>
+          </w:tcPr>
+          <w:p>
+            <w:pPr>
+              <w:jc w:val="center"/>
+            </w:pPr>
+            <w:r>
+              <w:rPr>
+                <w:rFonts w:ascii="Arial" w:cs="Arial" w:eastAsia="Arial" w:hAnsi="Arial"/>
+                <w:b/>
+                <w:bCs/>
+                <w:sz w:val="17"/>
+                <w:szCs w:val="17"/>
+              </w:rPr>
+              <w:t xml:space="preserve">COMPONENTE</w:t>
+            </w:r>
+          </w:p>
+        </w:tc>
+        <w:tc>
+          <w:tcPr>
+            <w:tcW w:type="dxa" w:w="726"/>
+            <w:tcBorders>
+              <w:top w:val="single" w:color="808080" w:sz="4"/>
+              <w:left w:val="single" w:color="808080" w:sz="4"/>
+              <w:bottom w:val="single" w:color="808080" w:sz="4"/>
+              <w:right w:val="single" w:color="808080" w:sz="4"/>
+            </w:tcBorders>
+            <w:shd w:fill="D9E2F3" w:color="auto" w:val="clear"/>
+            <w:tcMar>
+              <w:top w:type="dxa" w:w="60"/>
+              <w:left w:type="dxa" w:w="90"/>
+              <w:bottom w:type="dxa" w:w="60"/>
+              <w:right w:type="dxa" w:w="90"/>
+            </w:tcMar>
+          </w:tcPr>
+          <w:p>
+            <w:pPr>
+              <w:jc w:val="center"/>
+            </w:pPr>
+            <w:r>
+              <w:rPr>
+                <w:rFonts w:ascii="Arial" w:cs="Arial" w:eastAsia="Arial" w:hAnsi="Arial"/>
+                <w:b/>
+                <w:bCs/>
+                <w:sz w:val="17"/>
+                <w:szCs w:val="17"/>
+              </w:rPr>
+              <w:t xml:space="preserve">UND</w:t>
+            </w:r>
+          </w:p>
+        </w:tc>
+        <w:tc>
+          <w:tcPr>
+            <w:tcW w:type="dxa" w:w="1542"/>
+            <w:tcBorders>
+              <w:top w:val="single" w:color="808080" w:sz="4"/>
+              <w:left w:val="single" w:color="808080" w:sz="4"/>
+              <w:bottom w:val="single" w:color="808080" w:sz="4"/>
+              <w:right w:val="single" w:color="808080" w:sz="4"/>
+            </w:tcBorders>
+            <w:shd w:fill="D9E2F3" w:color="auto" w:val="clear"/>
+            <w:tcMar>
+              <w:top w:type="dxa" w:w="60"/>
+              <w:left w:type="dxa" w:w="90"/>
+              <w:bottom w:type="dxa" w:w="60"/>
+              <w:right w:type="dxa" w:w="90"/>
+            </w:tcMar>
+          </w:tcPr>
+          <w:p>
+            <w:pPr>
+              <w:jc w:val="center"/>
+            </w:pPr>
+            <w:r>
+              <w:rPr>
+                <w:rFonts w:ascii="Arial" w:cs="Arial" w:eastAsia="Arial" w:hAnsi="Arial"/>
+                <w:b/>
+                <w:bCs/>
+                <w:sz w:val="17"/>
+                <w:szCs w:val="17"/>
+              </w:rPr>
+              <w:t xml:space="preserve">POR LLORADERO</w:t>
+            </w:r>
+          </w:p>
+        </w:tc>
+        <w:tc>
+          <w:tcPr>
+            <w:tcW w:type="dxa" w:w="1361"/>
+            <w:tcBorders>
+              <w:top w:val="single" w:color="808080" w:sz="4"/>
+              <w:left w:val="single" w:color="808080" w:sz="4"/>
+              <w:bottom w:val="single" w:color="808080" w:sz="4"/>
+              <w:right w:val="single" w:color="808080" w:sz="4"/>
+            </w:tcBorders>
+            <w:shd w:fill="D9E2F3" w:color="auto" w:val="clear"/>
+            <w:tcMar>
+              <w:top w:type="dxa" w:w="60"/>
+              <w:left w:type="dxa" w:w="90"/>
+              <w:bottom w:type="dxa" w:w="60"/>
+              <w:right w:type="dxa" w:w="90"/>
+            </w:tcMar>
+          </w:tcPr>
+          <w:p>
+            <w:pPr>
+              <w:jc w:val="center"/>
+            </w:pPr>
+            <w:r>
+              <w:rPr>
+                <w:rFonts w:ascii="Arial" w:cs="Arial" w:eastAsia="Arial" w:hAnsi="Arial"/>
+                <w:b/>
+                <w:bCs/>
+                <w:sz w:val="17"/>
+                <w:szCs w:val="17"/>
+              </w:rPr>
+              <w:t xml:space="preserve">N° LLORADEROS</w:t>
+            </w:r>
+          </w:p>
+        </w:tc>
+        <w:tc>
+          <w:tcPr>
+            <w:tcW w:type="dxa" w:w="1451"/>
+            <w:tcBorders>
+              <w:top w:val="single" w:color="808080" w:sz="4"/>
+              <w:left w:val="single" w:color="808080" w:sz="4"/>
+              <w:bottom w:val="single" w:color="808080" w:sz="4"/>
+              <w:right w:val="single" w:color="808080" w:sz="4"/>
+            </w:tcBorders>
+            <w:shd w:fill="D9E2F3" w:color="auto" w:val="clear"/>
+            <w:tcMar>
+              <w:top w:type="dxa" w:w="60"/>
+              <w:left w:type="dxa" w:w="90"/>
+              <w:bottom w:type="dxa" w:w="60"/>
+              <w:right w:type="dxa" w:w="90"/>
+            </w:tcMar>
+          </w:tcPr>
+          <w:p>
+            <w:pPr>
+              <w:jc w:val="center"/>
+            </w:pPr>
+            <w:r>
+              <w:rPr>
+                <w:rFonts w:ascii="Arial" w:cs="Arial" w:eastAsia="Arial" w:hAnsi="Arial"/>
+                <w:b/>
+                <w:bCs/>
+                <w:sz w:val="17"/>
+                <w:szCs w:val="17"/>
+              </w:rPr>
+              <w:t xml:space="preserve">TOTAL</w:t>
+            </w:r>
+          </w:p>
+        </w:tc>
+      </w:tr>
+      <w:tr>
+        <w:tc>
+          <w:tcPr>
+            <w:tcW w:type="dxa" w:w="3991"/>
+            <w:tcBorders>
+              <w:top w:val="single" w:color="808080" w:sz="4"/>
+              <w:left w:val="single" w:color="808080" w:sz="4"/>
+              <w:bottom w:val="single" w:color="808080" w:sz="4"/>
+              <w:right w:val="single" w:color="808080" w:sz="4"/>
+            </w:tcBorders>
+            <w:tcMar>
+              <w:top w:type="dxa" w:w="60"/>
+              <w:left w:type="dxa" w:w="90"/>
+              <w:bottom w:type="dxa" w:w="60"/>
+              <w:right w:type="dxa" w:w="90"/>
+            </w:tcMar>
+          </w:tcPr>
+          <w:p>
+            <w:pPr>
+              <w:jc w:val="left"/>
+            </w:pPr>
+            <w:r>
+              <w:rPr>
+                <w:rFonts w:ascii="Arial" w:cs="Arial" w:eastAsia="Arial" w:hAnsi="Arial"/>
+                <w:b w:val="false"/>
+                <w:bCs w:val="false"/>
+                <w:sz w:val="17"/>
+                <w:szCs w:val="17"/>
+              </w:rPr>
+              <w:t xml:space="preserve">Tubo PVC-U Ø 3" para desagüe (NTP 399.003)</w:t>
+            </w:r>
+          </w:p>
+        </w:tc>
+        <w:tc>
+          <w:tcPr>
+            <w:tcW w:type="dxa" w:w="726"/>
+            <w:tcBorders>
+              <w:top w:val="single" w:color="808080" w:sz="4"/>
+              <w:left w:val="single" w:color="808080" w:sz="4"/>
+              <w:bottom w:val="single" w:color="808080" w:sz="4"/>
+              <w:right w:val="single" w:color="808080" w:sz="4"/>
+            </w:tcBorders>
+            <w:tcMar>
+              <w:top w:type="dxa" w:w="60"/>
+              <w:left w:type="dxa" w:w="90"/>
+              <w:bottom w:type="dxa" w:w="60"/>
+              <w:right w:type="dxa" w:w="90"/>
+            </w:tcMar>
+          </w:tcPr>
+          <w:p>
+            <w:pPr>
+              <w:jc w:val="left"/>
+            </w:pPr>
+            <w:r>
+              <w:rPr>
+                <w:rFonts w:ascii="Arial" w:cs="Arial" w:eastAsia="Arial" w:hAnsi="Arial"/>
+                <w:b w:val="false"/>
+                <w:bCs w:val="false"/>
+                <w:sz w:val="17"/>
+                <w:szCs w:val="17"/>
+              </w:rPr>
+              <w:t xml:space="preserve">m</w:t>
+            </w:r>
+          </w:p>
+        </w:tc>
+        <w:tc>
+          <w:tcPr>
+            <w:tcW w:type="dxa" w:w="1542"/>
+            <w:tcBorders>
+              <w:top w:val="single" w:color="808080" w:sz="4"/>
+              <w:left w:val="single" w:color="808080" w:sz="4"/>
+              <w:bottom w:val="single" w:color="808080" w:sz="4"/>
+              <w:right w:val="single" w:color="808080" w:sz="4"/>
+            </w:tcBorders>
+            <w:tcMar>
+              <w:top w:type="dxa" w:w="60"/>
+              <w:left w:type="dxa" w:w="90"/>
+              <w:bottom w:type="dxa" w:w="60"/>
+              <w:right w:type="dxa" w:w="90"/>
+            </w:tcMar>
+          </w:tcPr>
+          <w:p>
+            <w:pPr>
+              <w:jc w:val="left"/>
+            </w:pPr>
+            <w:r>
+              <w:rPr>
+                <w:rFonts w:ascii="Arial" w:cs="Arial" w:eastAsia="Arial" w:hAnsi="Arial"/>
+                <w:b w:val="false"/>
+                <w:bCs w:val="false"/>
+                <w:sz w:val="17"/>
+                <w:szCs w:val="17"/>
+              </w:rPr>
+              <w:t xml:space="preserve">0.3</w:t>
+            </w:r>
+          </w:p>
+        </w:tc>
+        <w:tc>
+          <w:tcPr>
+            <w:tcW w:type="dxa" w:w="1361"/>
+            <w:tcBorders>
+              <w:top w:val="single" w:color="808080" w:sz="4"/>
+              <w:left w:val="single" w:color="808080" w:sz="4"/>
+              <w:bottom w:val="single" w:color="808080" w:sz="4"/>
+              <w:right w:val="single" w:color="808080" w:sz="4"/>
+            </w:tcBorders>
+            <w:tcMar>
+              <w:top w:type="dxa" w:w="60"/>
+              <w:left w:type="dxa" w:w="90"/>
+              <w:bottom w:type="dxa" w:w="60"/>
+              <w:right w:type="dxa" w:w="90"/>
+            </w:tcMar>
+          </w:tcPr>
+          <w:p>
+            <w:pPr>
+              <w:jc w:val="left"/>
+            </w:pPr>
+            <w:r>
+              <w:rPr>
+                <w:rFonts w:ascii="Arial" w:cs="Arial" w:eastAsia="Arial" w:hAnsi="Arial"/>
+                <w:b w:val="false"/>
+                <w:bCs w:val="false"/>
+                <w:sz w:val="17"/>
+                <w:szCs w:val="17"/>
+              </w:rPr>
+              <w:t xml:space="preserve">226</w:t>
+            </w:r>
+          </w:p>
+        </w:tc>
+        <w:tc>
+          <w:tcPr>
+            <w:tcW w:type="dxa" w:w="1451"/>
+            <w:tcBorders>
+              <w:top w:val="single" w:color="808080" w:sz="4"/>
+              <w:left w:val="single" w:color="808080" w:sz="4"/>
+              <w:bottom w:val="single" w:color="808080" w:sz="4"/>
+              <w:right w:val="single" w:color="808080" w:sz="4"/>
+            </w:tcBorders>
+            <w:tcMar>
+              <w:top w:type="dxa" w:w="60"/>
+              <w:left w:type="dxa" w:w="90"/>
+              <w:bottom w:type="dxa" w:w="60"/>
+              <w:right w:type="dxa" w:w="90"/>
+            </w:tcMar>
+          </w:tcPr>
+          <w:p>
+            <w:pPr>
+              <w:jc w:val="left"/>
+            </w:pPr>
+            <w:r>
+              <w:rPr>
+                <w:rFonts w:ascii="Arial" w:cs="Arial" w:eastAsia="Arial" w:hAnsi="Arial"/>
+                <w:b w:val="false"/>
+                <w:bCs w:val="false"/>
+                <w:sz w:val="17"/>
+                <w:szCs w:val="17"/>
+              </w:rPr>
+              <w:t xml:space="preserve">67.8</w:t>
+            </w:r>
+          </w:p>
+        </w:tc>
+      </w:tr>
+      <w:tr>
+        <w:tc>
+          <w:tcPr>
+            <w:tcW w:type="dxa" w:w="3991"/>
+            <w:tcBorders>
+              <w:top w:val="single" w:color="808080" w:sz="4"/>
+              <w:left w:val="single" w:color="808080" w:sz="4"/>
+              <w:bottom w:val="single" w:color="808080" w:sz="4"/>
+              <w:right w:val="single" w:color="808080" w:sz="4"/>
+            </w:tcBorders>
+            <w:tcMar>
+              <w:top w:type="dxa" w:w="60"/>
+              <w:left w:type="dxa" w:w="90"/>
+              <w:bottom w:type="dxa" w:w="60"/>
+              <w:right w:type="dxa" w:w="90"/>
+            </w:tcMar>
+          </w:tcPr>
+          <w:p>
+            <w:pPr>
+              <w:jc w:val="left"/>
+            </w:pPr>
+            <w:r>
+              <w:rPr>
+                <w:rFonts w:ascii="Arial" w:cs="Arial" w:eastAsia="Arial" w:hAnsi="Arial"/>
+                <w:b w:val="false"/>
+                <w:bCs w:val="false"/>
+                <w:sz w:val="17"/>
+                <w:szCs w:val="17"/>
+              </w:rPr>
+              <w:t xml:space="preserve">Perforaciones Ø 3/8" en el tramo dentro del filtro</w:t>
+            </w:r>
+          </w:p>
+        </w:tc>
+        <w:tc>
+          <w:tcPr>
+            <w:tcW w:type="dxa" w:w="726"/>
+            <w:tcBorders>
+              <w:top w:val="single" w:color="808080" w:sz="4"/>
+              <w:left w:val="single" w:color="808080" w:sz="4"/>
+              <w:bottom w:val="single" w:color="808080" w:sz="4"/>
+              <w:right w:val="single" w:color="808080" w:sz="4"/>
+            </w:tcBorders>
+            <w:tcMar>
+              <w:top w:type="dxa" w:w="60"/>
+              <w:left w:type="dxa" w:w="90"/>
+              <w:bottom w:type="dxa" w:w="60"/>
+              <w:right w:type="dxa" w:w="90"/>
+            </w:tcMar>
+          </w:tcPr>
+          <w:p>
+            <w:pPr>
+              <w:jc w:val="left"/>
+            </w:pPr>
+            <w:r>
+              <w:rPr>
+                <w:rFonts w:ascii="Arial" w:cs="Arial" w:eastAsia="Arial" w:hAnsi="Arial"/>
+                <w:b w:val="false"/>
+                <w:bCs w:val="false"/>
+                <w:sz w:val="17"/>
+                <w:szCs w:val="17"/>
+              </w:rPr>
+              <w:t xml:space="preserve">und</w:t>
+            </w:r>
+          </w:p>
+        </w:tc>
+        <w:tc>
+          <w:tcPr>
+            <w:tcW w:type="dxa" w:w="1542"/>
+            <w:tcBorders>
+              <w:top w:val="single" w:color="808080" w:sz="4"/>
+              <w:left w:val="single" w:color="808080" w:sz="4"/>
+              <w:bottom w:val="single" w:color="808080" w:sz="4"/>
+              <w:right w:val="single" w:color="808080" w:sz="4"/>
+            </w:tcBorders>
+            <w:tcMar>
+              <w:top w:type="dxa" w:w="60"/>
+              <w:left w:type="dxa" w:w="90"/>
+              <w:bottom w:type="dxa" w:w="60"/>
+              <w:right w:type="dxa" w:w="90"/>
+            </w:tcMar>
+          </w:tcPr>
+          <w:p>
+            <w:pPr>
+              <w:jc w:val="left"/>
+            </w:pPr>
+            <w:r>
+              <w:rPr>
+                <w:rFonts w:ascii="Arial" w:cs="Arial" w:eastAsia="Arial" w:hAnsi="Arial"/>
+                <w:b w:val="false"/>
+                <w:bCs w:val="false"/>
+                <w:sz w:val="17"/>
+                <w:szCs w:val="17"/>
+              </w:rPr>
+              <w:t xml:space="preserve">8</w:t>
+            </w:r>
+          </w:p>
+        </w:tc>
+        <w:tc>
+          <w:tcPr>
+            <w:tcW w:type="dxa" w:w="1361"/>
+            <w:tcBorders>
+              <w:top w:val="single" w:color="808080" w:sz="4"/>
+              <w:left w:val="single" w:color="808080" w:sz="4"/>
+              <w:bottom w:val="single" w:color="808080" w:sz="4"/>
+              <w:right w:val="single" w:color="808080" w:sz="4"/>
+            </w:tcBorders>
+            <w:tcMar>
+              <w:top w:type="dxa" w:w="60"/>
+              <w:left w:type="dxa" w:w="90"/>
+              <w:bottom w:type="dxa" w:w="60"/>
+              <w:right w:type="dxa" w:w="90"/>
+            </w:tcMar>
+          </w:tcPr>
+          <w:p>
+            <w:pPr>
+              <w:jc w:val="left"/>
+            </w:pPr>
+            <w:r>
+              <w:rPr>
+                <w:rFonts w:ascii="Arial" w:cs="Arial" w:eastAsia="Arial" w:hAnsi="Arial"/>
+                <w:b w:val="false"/>
+                <w:bCs w:val="false"/>
+                <w:sz w:val="17"/>
+                <w:szCs w:val="17"/>
+              </w:rPr>
+              <w:t xml:space="preserve">226</w:t>
+            </w:r>
+          </w:p>
+        </w:tc>
+        <w:tc>
+          <w:tcPr>
+            <w:tcW w:type="dxa" w:w="1451"/>
+            <w:tcBorders>
+              <w:top w:val="single" w:color="808080" w:sz="4"/>
+              <w:left w:val="single" w:color="808080" w:sz="4"/>
+              <w:bottom w:val="single" w:color="808080" w:sz="4"/>
+              <w:right w:val="single" w:color="808080" w:sz="4"/>
+            </w:tcBorders>
+            <w:tcMar>
+              <w:top w:type="dxa" w:w="60"/>
+              <w:left w:type="dxa" w:w="90"/>
+              <w:bottom w:type="dxa" w:w="60"/>
+              <w:right w:type="dxa" w:w="90"/>
+            </w:tcMar>
+          </w:tcPr>
+          <w:p>
+            <w:pPr>
+              <w:jc w:val="left"/>
+            </w:pPr>
+            <w:r>
+              <w:rPr>
+                <w:rFonts w:ascii="Arial" w:cs="Arial" w:eastAsia="Arial" w:hAnsi="Arial"/>
+                <w:b w:val="false"/>
+                <w:bCs w:val="false"/>
+                <w:sz w:val="17"/>
+                <w:szCs w:val="17"/>
+              </w:rPr>
+              <w:t xml:space="preserve">1808</w:t>
+            </w:r>
+          </w:p>
+        </w:tc>
+      </w:tr>
+      <w:tr>
+        <w:tc>
+          <w:tcPr>
+            <w:tcW w:type="dxa" w:w="3991"/>
+            <w:tcBorders>
+              <w:top w:val="single" w:color="808080" w:sz="4"/>
+              <w:left w:val="single" w:color="808080" w:sz="4"/>
+              <w:bottom w:val="single" w:color="808080" w:sz="4"/>
+              <w:right w:val="single" w:color="808080" w:sz="4"/>
+            </w:tcBorders>
+            <w:tcMar>
+              <w:top w:type="dxa" w:w="60"/>
+              <w:left w:type="dxa" w:w="90"/>
+              <w:bottom w:type="dxa" w:w="60"/>
+              <w:right w:type="dxa" w:w="90"/>
+            </w:tcMar>
+          </w:tcPr>
+          <w:p>
+            <w:pPr>
+              <w:jc w:val="left"/>
+            </w:pPr>
+            <w:r>
+              <w:rPr>
+                <w:rFonts w:ascii="Arial" w:cs="Arial" w:eastAsia="Arial" w:hAnsi="Arial"/>
+                <w:b w:val="false"/>
+                <w:bCs w:val="false"/>
+                <w:sz w:val="17"/>
+                <w:szCs w:val="17"/>
+              </w:rPr>
+              <w:t xml:space="preserve">Excavación local del hueco del filtro (lado^3)</w:t>
+            </w:r>
+          </w:p>
+        </w:tc>
+        <w:tc>
+          <w:tcPr>
+            <w:tcW w:type="dxa" w:w="726"/>
+            <w:tcBorders>
+              <w:top w:val="single" w:color="808080" w:sz="4"/>
+              <w:left w:val="single" w:color="808080" w:sz="4"/>
+              <w:bottom w:val="single" w:color="808080" w:sz="4"/>
+              <w:right w:val="single" w:color="808080" w:sz="4"/>
+            </w:tcBorders>
+            <w:tcMar>
+              <w:top w:type="dxa" w:w="60"/>
+              <w:left w:type="dxa" w:w="90"/>
+              <w:bottom w:type="dxa" w:w="60"/>
+              <w:right w:type="dxa" w:w="90"/>
+            </w:tcMar>
+          </w:tcPr>
+          <w:p>
+            <w:pPr>
+              <w:jc w:val="left"/>
+            </w:pPr>
+            <w:r>
+              <w:rPr>
+                <w:rFonts w:ascii="Arial" w:cs="Arial" w:eastAsia="Arial" w:hAnsi="Arial"/>
+                <w:b w:val="false"/>
+                <w:bCs w:val="false"/>
+                <w:sz w:val="17"/>
+                <w:szCs w:val="17"/>
+              </w:rPr>
+              <w:t xml:space="preserve">m3</w:t>
+            </w:r>
+          </w:p>
+        </w:tc>
+        <w:tc>
+          <w:tcPr>
+            <w:tcW w:type="dxa" w:w="1542"/>
+            <w:tcBorders>
+              <w:top w:val="single" w:color="808080" w:sz="4"/>
+              <w:left w:val="single" w:color="808080" w:sz="4"/>
+              <w:bottom w:val="single" w:color="808080" w:sz="4"/>
+              <w:right w:val="single" w:color="808080" w:sz="4"/>
+            </w:tcBorders>
+            <w:tcMar>
+              <w:top w:type="dxa" w:w="60"/>
+              <w:left w:type="dxa" w:w="90"/>
+              <w:bottom w:type="dxa" w:w="60"/>
+              <w:right w:type="dxa" w:w="90"/>
+            </w:tcMar>
+          </w:tcPr>
+          <w:p>
+            <w:pPr>
+              <w:jc w:val="left"/>
+            </w:pPr>
+            <w:r>
+              <w:rPr>
+                <w:rFonts w:ascii="Arial" w:cs="Arial" w:eastAsia="Arial" w:hAnsi="Arial"/>
+                <w:b w:val="false"/>
+                <w:bCs w:val="false"/>
+                <w:sz w:val="17"/>
+                <w:szCs w:val="17"/>
+              </w:rPr>
+              <w:t xml:space="preserve">0.027</w:t>
+            </w:r>
+          </w:p>
+        </w:tc>
+        <w:tc>
+          <w:tcPr>
+            <w:tcW w:type="dxa" w:w="1361"/>
+            <w:tcBorders>
+              <w:top w:val="single" w:color="808080" w:sz="4"/>
+              <w:left w:val="single" w:color="808080" w:sz="4"/>
+              <w:bottom w:val="single" w:color="808080" w:sz="4"/>
+              <w:right w:val="single" w:color="808080" w:sz="4"/>
+            </w:tcBorders>
+            <w:tcMar>
+              <w:top w:type="dxa" w:w="60"/>
+              <w:left w:type="dxa" w:w="90"/>
+              <w:bottom w:type="dxa" w:w="60"/>
+              <w:right w:type="dxa" w:w="90"/>
+            </w:tcMar>
+          </w:tcPr>
+          <w:p>
+            <w:pPr>
+              <w:jc w:val="left"/>
+            </w:pPr>
+            <w:r>
+              <w:rPr>
+                <w:rFonts w:ascii="Arial" w:cs="Arial" w:eastAsia="Arial" w:hAnsi="Arial"/>
+                <w:b w:val="false"/>
+                <w:bCs w:val="false"/>
+                <w:sz w:val="17"/>
+                <w:szCs w:val="17"/>
+              </w:rPr>
+              <w:t xml:space="preserve">226</w:t>
+            </w:r>
+          </w:p>
+        </w:tc>
+        <w:tc>
+          <w:tcPr>
+            <w:tcW w:type="dxa" w:w="1451"/>
+            <w:tcBorders>
+              <w:top w:val="single" w:color="808080" w:sz="4"/>
+              <w:left w:val="single" w:color="808080" w:sz="4"/>
+              <w:bottom w:val="single" w:color="808080" w:sz="4"/>
+              <w:right w:val="single" w:color="808080" w:sz="4"/>
+            </w:tcBorders>
+            <w:tcMar>
+              <w:top w:type="dxa" w:w="60"/>
+              <w:left w:type="dxa" w:w="90"/>
+              <w:bottom w:type="dxa" w:w="60"/>
+              <w:right w:type="dxa" w:w="90"/>
+            </w:tcMar>
+          </w:tcPr>
+          <w:p>
+            <w:pPr>
+              <w:jc w:val="left"/>
+            </w:pPr>
+            <w:r>
+              <w:rPr>
+                <w:rFonts w:ascii="Arial" w:cs="Arial" w:eastAsia="Arial" w:hAnsi="Arial"/>
+                <w:b w:val="false"/>
+                <w:bCs w:val="false"/>
+                <w:sz w:val="17"/>
+                <w:szCs w:val="17"/>
+              </w:rPr>
+              <w:t xml:space="preserve">6.1</w:t>
+            </w:r>
+          </w:p>
+        </w:tc>
+      </w:tr>
+      <w:tr>
+        <w:tc>
+          <w:tcPr>
+            <w:tcW w:type="dxa" w:w="3991"/>
+            <w:tcBorders>
+              <w:top w:val="single" w:color="808080" w:sz="4"/>
+              <w:left w:val="single" w:color="808080" w:sz="4"/>
+              <w:bottom w:val="single" w:color="808080" w:sz="4"/>
+              <w:right w:val="single" w:color="808080" w:sz="4"/>
+            </w:tcBorders>
+            <w:tcMar>
+              <w:top w:type="dxa" w:w="60"/>
+              <w:left w:type="dxa" w:w="90"/>
+              <w:bottom w:type="dxa" w:w="60"/>
+              <w:right w:type="dxa" w:w="90"/>
+            </w:tcMar>
+          </w:tcPr>
+          <w:p>
+            <w:pPr>
+              <w:jc w:val="left"/>
+            </w:pPr>
+            <w:r>
+              <w:rPr>
+                <w:rFonts w:ascii="Arial" w:cs="Arial" w:eastAsia="Arial" w:hAnsi="Arial"/>
+                <w:b w:val="false"/>
+                <w:bCs w:val="false"/>
+                <w:sz w:val="17"/>
+                <w:szCs w:val="17"/>
+              </w:rPr>
+              <w:t xml:space="preserve">Grava filtrante (ripio) 20 a 40 mm: lado^3 + desperdicio</w:t>
+            </w:r>
+          </w:p>
+        </w:tc>
+        <w:tc>
+          <w:tcPr>
+            <w:tcW w:type="dxa" w:w="726"/>
+            <w:tcBorders>
+              <w:top w:val="single" w:color="808080" w:sz="4"/>
+              <w:left w:val="single" w:color="808080" w:sz="4"/>
+              <w:bottom w:val="single" w:color="808080" w:sz="4"/>
+              <w:right w:val="single" w:color="808080" w:sz="4"/>
+            </w:tcBorders>
+            <w:tcMar>
+              <w:top w:type="dxa" w:w="60"/>
+              <w:left w:type="dxa" w:w="90"/>
+              <w:bottom w:type="dxa" w:w="60"/>
+              <w:right w:type="dxa" w:w="90"/>
+            </w:tcMar>
+          </w:tcPr>
+          <w:p>
+            <w:pPr>
+              <w:jc w:val="left"/>
+            </w:pPr>
+            <w:r>
+              <w:rPr>
+                <w:rFonts w:ascii="Arial" w:cs="Arial" w:eastAsia="Arial" w:hAnsi="Arial"/>
+                <w:b w:val="false"/>
+                <w:bCs w:val="false"/>
+                <w:sz w:val="17"/>
+                <w:szCs w:val="17"/>
+              </w:rPr>
+              <w:t xml:space="preserve">m3</w:t>
+            </w:r>
+          </w:p>
+        </w:tc>
+        <w:tc>
+          <w:tcPr>
+            <w:tcW w:type="dxa" w:w="1542"/>
+            <w:tcBorders>
+              <w:top w:val="single" w:color="808080" w:sz="4"/>
+              <w:left w:val="single" w:color="808080" w:sz="4"/>
+              <w:bottom w:val="single" w:color="808080" w:sz="4"/>
+              <w:right w:val="single" w:color="808080" w:sz="4"/>
+            </w:tcBorders>
+            <w:tcMar>
+              <w:top w:type="dxa" w:w="60"/>
+              <w:left w:type="dxa" w:w="90"/>
+              <w:bottom w:type="dxa" w:w="60"/>
+              <w:right w:type="dxa" w:w="90"/>
+            </w:tcMar>
+          </w:tcPr>
+          <w:p>
+            <w:pPr>
+              <w:jc w:val="left"/>
+            </w:pPr>
+            <w:r>
+              <w:rPr>
+                <w:rFonts w:ascii="Arial" w:cs="Arial" w:eastAsia="Arial" w:hAnsi="Arial"/>
+                <w:b w:val="false"/>
+                <w:bCs w:val="false"/>
+                <w:sz w:val="17"/>
+                <w:szCs w:val="17"/>
+              </w:rPr>
+              <w:t xml:space="preserve">0.0297</w:t>
+            </w:r>
+          </w:p>
+        </w:tc>
+        <w:tc>
+          <w:tcPr>
+            <w:tcW w:type="dxa" w:w="1361"/>
+            <w:tcBorders>
+              <w:top w:val="single" w:color="808080" w:sz="4"/>
+              <w:left w:val="single" w:color="808080" w:sz="4"/>
+              <w:bottom w:val="single" w:color="808080" w:sz="4"/>
+              <w:right w:val="single" w:color="808080" w:sz="4"/>
+            </w:tcBorders>
+            <w:tcMar>
+              <w:top w:type="dxa" w:w="60"/>
+              <w:left w:type="dxa" w:w="90"/>
+              <w:bottom w:type="dxa" w:w="60"/>
+              <w:right w:type="dxa" w:w="90"/>
+            </w:tcMar>
+          </w:tcPr>
+          <w:p>
+            <w:pPr>
+              <w:jc w:val="left"/>
+            </w:pPr>
+            <w:r>
+              <w:rPr>
+                <w:rFonts w:ascii="Arial" w:cs="Arial" w:eastAsia="Arial" w:hAnsi="Arial"/>
+                <w:b w:val="false"/>
+                <w:bCs w:val="false"/>
+                <w:sz w:val="17"/>
+                <w:szCs w:val="17"/>
+              </w:rPr>
+              <w:t xml:space="preserve">226</w:t>
+            </w:r>
+          </w:p>
+        </w:tc>
+        <w:tc>
+          <w:tcPr>
+            <w:tcW w:type="dxa" w:w="1451"/>
+            <w:tcBorders>
+              <w:top w:val="single" w:color="808080" w:sz="4"/>
+              <w:left w:val="single" w:color="808080" w:sz="4"/>
+              <w:bottom w:val="single" w:color="808080" w:sz="4"/>
+              <w:right w:val="single" w:color="808080" w:sz="4"/>
+            </w:tcBorders>
+            <w:tcMar>
+              <w:top w:type="dxa" w:w="60"/>
+              <w:left w:type="dxa" w:w="90"/>
+              <w:bottom w:type="dxa" w:w="60"/>
+              <w:right w:type="dxa" w:w="90"/>
+            </w:tcMar>
+          </w:tcPr>
+          <w:p>
+            <w:pPr>
+              <w:jc w:val="left"/>
+            </w:pPr>
+            <w:r>
+              <w:rPr>
+                <w:rFonts w:ascii="Arial" w:cs="Arial" w:eastAsia="Arial" w:hAnsi="Arial"/>
+                <w:b w:val="false"/>
+                <w:bCs w:val="false"/>
+                <w:sz w:val="17"/>
+                <w:szCs w:val="17"/>
+              </w:rPr>
+              <w:t xml:space="preserve">6.71</w:t>
+            </w:r>
+          </w:p>
+        </w:tc>
+      </w:tr>
+      <w:tr>
+        <w:tc>
+          <w:tcPr>
+            <w:tcW w:type="dxa" w:w="3991"/>
+            <w:tcBorders>
+              <w:top w:val="single" w:color="808080" w:sz="4"/>
+              <w:left w:val="single" w:color="808080" w:sz="4"/>
+              <w:bottom w:val="single" w:color="808080" w:sz="4"/>
+              <w:right w:val="single" w:color="808080" w:sz="4"/>
+            </w:tcBorders>
+            <w:tcMar>
+              <w:top w:type="dxa" w:w="60"/>
+              <w:left w:type="dxa" w:w="90"/>
+              <w:bottom w:type="dxa" w:w="60"/>
+              <w:right w:type="dxa" w:w="90"/>
+            </w:tcMar>
+          </w:tcPr>
+          <w:p>
+            <w:pPr>
+              <w:jc w:val="left"/>
+            </w:pPr>
+            <w:r>
+              <w:rPr>
+                <w:rFonts w:ascii="Arial" w:cs="Arial" w:eastAsia="Arial" w:hAnsi="Arial"/>
+                <w:b w:val="false"/>
+                <w:bCs w:val="false"/>
+                <w:sz w:val="17"/>
+                <w:szCs w:val="17"/>
+              </w:rPr>
+              <w:t xml:space="preserve">Geotextil no tejido clase 2: 6 caras del cubo + traslapes</w:t>
+            </w:r>
+          </w:p>
+        </w:tc>
+        <w:tc>
+          <w:tcPr>
+            <w:tcW w:type="dxa" w:w="726"/>
+            <w:tcBorders>
+              <w:top w:val="single" w:color="808080" w:sz="4"/>
+              <w:left w:val="single" w:color="808080" w:sz="4"/>
+              <w:bottom w:val="single" w:color="808080" w:sz="4"/>
+              <w:right w:val="single" w:color="808080" w:sz="4"/>
+            </w:tcBorders>
+            <w:tcMar>
+              <w:top w:type="dxa" w:w="60"/>
+              <w:left w:type="dxa" w:w="90"/>
+              <w:bottom w:type="dxa" w:w="60"/>
+              <w:right w:type="dxa" w:w="90"/>
+            </w:tcMar>
+          </w:tcPr>
+          <w:p>
+            <w:pPr>
+              <w:jc w:val="left"/>
+            </w:pPr>
+            <w:r>
+              <w:rPr>
+                <w:rFonts w:ascii="Arial" w:cs="Arial" w:eastAsia="Arial" w:hAnsi="Arial"/>
+                <w:b w:val="false"/>
+                <w:bCs w:val="false"/>
+                <w:sz w:val="17"/>
+                <w:szCs w:val="17"/>
+              </w:rPr>
+              <w:t xml:space="preserve">m2</w:t>
+            </w:r>
+          </w:p>
+        </w:tc>
+        <w:tc>
+          <w:tcPr>
+            <w:tcW w:type="dxa" w:w="1542"/>
+            <w:tcBorders>
+              <w:top w:val="single" w:color="808080" w:sz="4"/>
+              <w:left w:val="single" w:color="808080" w:sz="4"/>
+              <w:bottom w:val="single" w:color="808080" w:sz="4"/>
+              <w:right w:val="single" w:color="808080" w:sz="4"/>
+            </w:tcBorders>
+            <w:tcMar>
+              <w:top w:type="dxa" w:w="60"/>
+              <w:left w:type="dxa" w:w="90"/>
+              <w:bottom w:type="dxa" w:w="60"/>
+              <w:right w:type="dxa" w:w="90"/>
+            </w:tcMar>
+          </w:tcPr>
+          <w:p>
+            <w:pPr>
+              <w:jc w:val="left"/>
+            </w:pPr>
+            <w:r>
+              <w:rPr>
+                <w:rFonts w:ascii="Arial" w:cs="Arial" w:eastAsia="Arial" w:hAnsi="Arial"/>
+                <w:b w:val="false"/>
+                <w:bCs w:val="false"/>
+                <w:sz w:val="17"/>
+                <w:szCs w:val="17"/>
+              </w:rPr>
+              <w:t xml:space="preserve">0.594</w:t>
+            </w:r>
+          </w:p>
+        </w:tc>
+        <w:tc>
+          <w:tcPr>
+            <w:tcW w:type="dxa" w:w="1361"/>
+            <w:tcBorders>
+              <w:top w:val="single" w:color="808080" w:sz="4"/>
+              <w:left w:val="single" w:color="808080" w:sz="4"/>
+              <w:bottom w:val="single" w:color="808080" w:sz="4"/>
+              <w:right w:val="single" w:color="808080" w:sz="4"/>
+            </w:tcBorders>
+            <w:tcMar>
+              <w:top w:type="dxa" w:w="60"/>
+              <w:left w:type="dxa" w:w="90"/>
+              <w:bottom w:type="dxa" w:w="60"/>
+              <w:right w:type="dxa" w:w="90"/>
+            </w:tcMar>
+          </w:tcPr>
+          <w:p>
+            <w:pPr>
+              <w:jc w:val="left"/>
+            </w:pPr>
+            <w:r>
+              <w:rPr>
+                <w:rFonts w:ascii="Arial" w:cs="Arial" w:eastAsia="Arial" w:hAnsi="Arial"/>
+                <w:b w:val="false"/>
+                <w:bCs w:val="false"/>
+                <w:sz w:val="17"/>
+                <w:szCs w:val="17"/>
+              </w:rPr>
+              <w:t xml:space="preserve">226</w:t>
+            </w:r>
+          </w:p>
+        </w:tc>
+        <w:tc>
+          <w:tcPr>
+            <w:tcW w:type="dxa" w:w="1451"/>
+            <w:tcBorders>
+              <w:top w:val="single" w:color="808080" w:sz="4"/>
+              <w:left w:val="single" w:color="808080" w:sz="4"/>
+              <w:bottom w:val="single" w:color="808080" w:sz="4"/>
+              <w:right w:val="single" w:color="808080" w:sz="4"/>
+            </w:tcBorders>
+            <w:tcMar>
+              <w:top w:type="dxa" w:w="60"/>
+              <w:left w:type="dxa" w:w="90"/>
+              <w:bottom w:type="dxa" w:w="60"/>
+              <w:right w:type="dxa" w:w="90"/>
+            </w:tcMar>
+          </w:tcPr>
+          <w:p>
+            <w:pPr>
+              <w:jc w:val="left"/>
+            </w:pPr>
+            <w:r>
+              <w:rPr>
+                <w:rFonts w:ascii="Arial" w:cs="Arial" w:eastAsia="Arial" w:hAnsi="Arial"/>
+                <w:b w:val="false"/>
+                <w:bCs w:val="false"/>
+                <w:sz w:val="17"/>
+                <w:szCs w:val="17"/>
+              </w:rPr>
+              <w:t xml:space="preserve">134.24</w:t>
+            </w:r>
+          </w:p>
+        </w:tc>
+      </w:tr>
+      <w:tr>
+        <w:tc>
+          <w:tcPr>
+            <w:tcW w:type="dxa" w:w="3991"/>
+            <w:tcBorders>
+              <w:top w:val="single" w:color="808080" w:sz="4"/>
+              <w:left w:val="single" w:color="808080" w:sz="4"/>
+              <w:bottom w:val="single" w:color="808080" w:sz="4"/>
+              <w:right w:val="single" w:color="808080" w:sz="4"/>
+            </w:tcBorders>
+            <w:tcMar>
+              <w:top w:type="dxa" w:w="60"/>
+              <w:left w:type="dxa" w:w="90"/>
+              <w:bottom w:type="dxa" w:w="60"/>
+              <w:right w:type="dxa" w:w="90"/>
+            </w:tcMar>
+          </w:tcPr>
+          <w:p>
+            <w:pPr>
+              <w:jc w:val="left"/>
+            </w:pPr>
+            <w:r>
+              <w:rPr>
+                <w:rFonts w:ascii="Arial" w:cs="Arial" w:eastAsia="Arial" w:hAnsi="Arial"/>
+                <w:b w:val="false"/>
+                <w:bCs w:val="false"/>
+                <w:sz w:val="17"/>
+                <w:szCs w:val="17"/>
+              </w:rPr>
+              <w:t xml:space="preserve">Mortero 1:3 de sellado alrededor del tubo</w:t>
+            </w:r>
+          </w:p>
+        </w:tc>
+        <w:tc>
+          <w:tcPr>
+            <w:tcW w:type="dxa" w:w="726"/>
+            <w:tcBorders>
+              <w:top w:val="single" w:color="808080" w:sz="4"/>
+              <w:left w:val="single" w:color="808080" w:sz="4"/>
+              <w:bottom w:val="single" w:color="808080" w:sz="4"/>
+              <w:right w:val="single" w:color="808080" w:sz="4"/>
+            </w:tcBorders>
+            <w:tcMar>
+              <w:top w:type="dxa" w:w="60"/>
+              <w:left w:type="dxa" w:w="90"/>
+              <w:bottom w:type="dxa" w:w="60"/>
+              <w:right w:type="dxa" w:w="90"/>
+            </w:tcMar>
+          </w:tcPr>
+          <w:p>
+            <w:pPr>
+              <w:jc w:val="left"/>
+            </w:pPr>
+            <w:r>
+              <w:rPr>
+                <w:rFonts w:ascii="Arial" w:cs="Arial" w:eastAsia="Arial" w:hAnsi="Arial"/>
+                <w:b w:val="false"/>
+                <w:bCs w:val="false"/>
+                <w:sz w:val="17"/>
+                <w:szCs w:val="17"/>
+              </w:rPr>
+              <w:t xml:space="preserve">m3</w:t>
+            </w:r>
+          </w:p>
+        </w:tc>
+        <w:tc>
+          <w:tcPr>
+            <w:tcW w:type="dxa" w:w="1542"/>
+            <w:tcBorders>
+              <w:top w:val="single" w:color="808080" w:sz="4"/>
+              <w:left w:val="single" w:color="808080" w:sz="4"/>
+              <w:bottom w:val="single" w:color="808080" w:sz="4"/>
+              <w:right w:val="single" w:color="808080" w:sz="4"/>
+            </w:tcBorders>
+            <w:tcMar>
+              <w:top w:type="dxa" w:w="60"/>
+              <w:left w:type="dxa" w:w="90"/>
+              <w:bottom w:type="dxa" w:w="60"/>
+              <w:right w:type="dxa" w:w="90"/>
+            </w:tcMar>
+          </w:tcPr>
+          <w:p>
+            <w:pPr>
+              <w:jc w:val="left"/>
+            </w:pPr>
+            <w:r>
+              <w:rPr>
+                <w:rFonts w:ascii="Arial" w:cs="Arial" w:eastAsia="Arial" w:hAnsi="Arial"/>
+                <w:b w:val="false"/>
+                <w:bCs w:val="false"/>
+                <w:sz w:val="17"/>
+                <w:szCs w:val="17"/>
+              </w:rPr>
+              <w:t xml:space="preserve">0.0005</w:t>
+            </w:r>
+          </w:p>
+        </w:tc>
+        <w:tc>
+          <w:tcPr>
+            <w:tcW w:type="dxa" w:w="1361"/>
+            <w:tcBorders>
+              <w:top w:val="single" w:color="808080" w:sz="4"/>
+              <w:left w:val="single" w:color="808080" w:sz="4"/>
+              <w:bottom w:val="single" w:color="808080" w:sz="4"/>
+              <w:right w:val="single" w:color="808080" w:sz="4"/>
+            </w:tcBorders>
+            <w:tcMar>
+              <w:top w:type="dxa" w:w="60"/>
+              <w:left w:type="dxa" w:w="90"/>
+              <w:bottom w:type="dxa" w:w="60"/>
+              <w:right w:type="dxa" w:w="90"/>
+            </w:tcMar>
+          </w:tcPr>
+          <w:p>
+            <w:pPr>
+              <w:jc w:val="left"/>
+            </w:pPr>
+            <w:r>
+              <w:rPr>
+                <w:rFonts w:ascii="Arial" w:cs="Arial" w:eastAsia="Arial" w:hAnsi="Arial"/>
+                <w:b w:val="false"/>
+                <w:bCs w:val="false"/>
+                <w:sz w:val="17"/>
+                <w:szCs w:val="17"/>
+              </w:rPr>
+              <w:t xml:space="preserve">226</w:t>
+            </w:r>
+          </w:p>
+        </w:tc>
+        <w:tc>
+          <w:tcPr>
+            <w:tcW w:type="dxa" w:w="1451"/>
+            <w:tcBorders>
+              <w:top w:val="single" w:color="808080" w:sz="4"/>
+              <w:left w:val="single" w:color="808080" w:sz="4"/>
+              <w:bottom w:val="single" w:color="808080" w:sz="4"/>
+              <w:right w:val="single" w:color="808080" w:sz="4"/>
+            </w:tcBorders>
+            <w:tcMar>
+              <w:top w:type="dxa" w:w="60"/>
+              <w:left w:type="dxa" w:w="90"/>
+              <w:bottom w:type="dxa" w:w="60"/>
+              <w:right w:type="dxa" w:w="90"/>
+            </w:tcMar>
+          </w:tcPr>
+          <w:p>
+            <w:pPr>
+              <w:jc w:val="left"/>
+            </w:pPr>
+            <w:r>
+              <w:rPr>
+                <w:rFonts w:ascii="Arial" w:cs="Arial" w:eastAsia="Arial" w:hAnsi="Arial"/>
+                <w:b w:val="false"/>
+                <w:bCs w:val="false"/>
+                <w:sz w:val="17"/>
+                <w:szCs w:val="17"/>
+              </w:rPr>
+              <w:t xml:space="preserve">0.11</w:t>
+            </w:r>
+          </w:p>
+        </w:tc>
+      </w:tr>
+    </w:tbl>
+    <w:p>
+      <w:pPr>
+        <w:spacing w:after="60" w:before="0" w:line="276"/>
+        <w:jc w:val="both"/>
+      </w:pPr>
+      <w:r>
+        <w:rPr>
+          <w:rFonts w:ascii="Arial" w:cs="Arial" w:eastAsia="Arial" w:hAnsi="Arial"/>
+          <w:sz w:val="20"/>
+          <w:szCs w:val="20"/>
+        </w:rPr>
+        <w:t xml:space="preserve"/>
       </w:r>
     </w:p>
     <w:p>
@@ -20488,7 +21678,7 @@
           <w:sz w:val="20"/>
           <w:szCs w:val="20"/>
         </w:rPr>
-        <w:t xml:space="preserve">Comprende el registro de limpieza completo del colector pluvial frontal del CAR Varones con tapa CIEGA de concreto armado, sin marco ni contramarco metálico: rebaje de 0.70 x 0.70 x 0.08 m formado en la losa superior como asiento de la tapa (0.05 m por lado), luz libre de 0.60 x 0.60 m, borde engrosado de 0.15 x 0.10 m bajo la losa solo en los 2 lados transversales, entre muros (en los lados largos el asiento queda sobre la cabeza de los muros) con refuerzo de borde de 2 barras de 1/2" por lado (L = 1.40 m), y tapa de concreto armado f'c = 210 kg/cm² de 0.68 x 0.68 x 0.08 m vaciada aparte en obra, con parrilla de 7 + 7 barras de 3/8" @0.10 m, dos asas de fierro liso de 1/2" (0.50 m) en cajuelas de 0.19 x 0.06 x 0.03 m y cantos biselados de 1 x 1 cm, todo según las láminas DP-06B, DP-06D, DD-01 y DD-02.</w:t>
+        <w:t xml:space="preserve">Comprende el registro de limpieza completo del colector pluvial frontal del CAR Varones con tapa CIEGA de concreto armado, sin marco ni contramarco metálico: rebaje de 0.70 x 0.70 x 0.08 m formado en la losa superior como asiento de la tapa (0.05 m por lado), luz libre de 0.60 x 0.60 m, borde engrosado de 0.15 x 0.10 m bajo la losa solo en los 2 lados transversales, entre muros (en los lados largos el asiento queda sobre la cabeza de los muros) con refuerzo de borde de 2 barras de 1/2" por lado (L = 1.40 m), y tapa de concreto armado f'c = 210 kg/cm² de 0.68 x 0.68 x 0.08 m vaciada aparte en obra, con parrilla de 7 + 7 barras de 3/8" @0.10 m, dos asas de fierro liso de 1/2" (0.50 m) en cajuelas de 0.19 x 0.06 x 0.03 m y cantos biselados de 1 x 1 cm, todo según las láminas DPLV-23, DPLV-26, DPLV-27 y DPLV-28.</w:t>
       </w:r>
     </w:p>
     <w:p>
@@ -20919,7 +22109,7 @@
           <w:sz w:val="20"/>
           <w:szCs w:val="20"/>
         </w:rPr>
-        <w:t xml:space="preserve">Comprende la junta de dilatación de 1" (25 mm) en toda la sección del colector pluvial frontal del CAR Varones, cada 4.00 m (26 juntas) y en los cambios de sección, rellena con plancha de poliestireno expandido (tecnopor) y sellada con sellador asfáltico de 1" x 2" (25 x 50 mm) de asfalto líquido RC-250 y arena gruesa en las caras interiores y en la cara superior, según la lámina DD-03 y la sección 510 de la EG-2013 del MTC.</w:t>
+        <w:t xml:space="preserve">Comprende la junta de dilatación de 1" (25 mm) en toda la sección del colector pluvial frontal del CAR Varones, cada 4.00 m (26 juntas) y en los cambios de sección, rellena con plancha de poliestireno expandido (tecnopor) y sellada con sellador asfáltico de 1" x 2" (25 x 50 mm) de asfalto líquido RC-250 y arena gruesa en las caras interiores y en la cara superior, según la lámina DPLV-29 y la sección 510 de la EG-2013 del MTC.</w:t>
       </w:r>
     </w:p>
     <w:p>
@@ -21327,7 +22517,7 @@
           <w:sz w:val="20"/>
           <w:szCs w:val="20"/>
         </w:rPr>
-        <w:t xml:space="preserve">Comprende la junta de 1" con plancha de poliestireno expandido (tecnopor) en todo el contacto del colector pluvial frontal del CAR Varones con el muro este de la caja de llegada CL (sección completa del colector menos su hueco interior), de modo que ambas estructuras trabajen en forma independiente, y el sellador asfáltico de 1" x 2" (asfalto líquido RC-250 + arena gruesa) en las caras interiores y en la cara superior, según la lámina DD-03 (vista C). A ambos lados del colector hay terreno natural, por lo que no lleva junta longitudinal; la losa superior del colector sirve de vereda.</w:t>
+        <w:t xml:space="preserve">Comprende la junta de 1" con plancha de poliestireno expandido (tecnopor) en todo el contacto del colector pluvial frontal del CAR Varones con el muro este de la caja de llegada CL (sección completa del colector menos su hueco interior), de modo que ambas estructuras trabajen en forma independiente, y el sellador asfáltico de 1" x 2" (asfalto líquido RC-250 + arena gruesa) en las caras interiores y en la cara superior, según la lámina DPLV-29. A ambos lados del colector hay terreno natural, por lo que no lleva junta longitudinal; la losa superior del colector sirve de vereda.</w:t>
       </w:r>
     </w:p>
     <w:p>

</xml_diff>